<commit_message>
Add formatted Word templates for document builder
</commit_message>
<xml_diff>
--- a/document_templates/docx/claims/claim_generic.docx
+++ b/document_templates/docx/claims/claim_generic.docx
@@ -4,6 +4,7 @@
   <w:body>
     <w:p>
       <w:pPr>
+        <w:spacing w:after="120" w:line="276" w:lineRule="auto"/>
         <w:jc w:val="right"/>
         <w:rPr>
           <w:rFonts w:ascii="Times New Roman" w:hAnsi="Times New Roman" w:cs="Times New Roman"/>
@@ -40,6 +41,7 @@
     </w:p>
     <w:p>
       <w:pPr>
+        <w:spacing w:after="120" w:line="276" w:lineRule="auto"/>
         <w:jc w:val="right"/>
         <w:rPr>
           <w:rFonts w:ascii="Times New Roman" w:hAnsi="Times New Roman" w:cs="Times New Roman"/>
@@ -48,6 +50,7 @@
     </w:p>
     <w:p>
       <w:pPr>
+        <w:spacing w:after="120" w:line="276" w:lineRule="auto"/>
         <w:jc w:val="right"/>
         <w:rPr>
           <w:rFonts w:ascii="Times New Roman" w:hAnsi="Times New Roman" w:cs="Times New Roman"/>
@@ -57,7 +60,153 @@
         <w:rPr>
           <w:rFonts w:ascii="Times New Roman" w:hAnsi="Times New Roman" w:cs="Times New Roman"/>
         </w:rPr>
-        <w:t xml:space="preserve">От: </w:t>
+        <w:t xml:space="preserve">От: {{ </w:t>
+      </w:r>
+      <w:proofErr w:type="spellStart"/>
+      <w:r>
+        <w:rPr>
+          <w:rFonts w:ascii="Times New Roman" w:hAnsi="Times New Roman" w:cs="Times New Roman"/>
+        </w:rPr>
+        <w:t>sender</w:t>
+      </w:r>
+      <w:proofErr w:type="spellEnd"/>
+      <w:r>
+        <w:rPr>
+          <w:rFonts w:ascii="Times New Roman" w:hAnsi="Times New Roman" w:cs="Times New Roman"/>
+        </w:rPr>
+        <w:t xml:space="preserve"> }}</w:t>
+      </w:r>
+    </w:p>
+    <w:p>
+      <w:pPr>
+        <w:spacing w:after="120" w:line="276" w:lineRule="auto"/>
+        <w:rPr>
+          <w:rFonts w:ascii="Times New Roman" w:hAnsi="Times New Roman" w:cs="Times New Roman"/>
+        </w:rPr>
+      </w:pPr>
+    </w:p>
+    <w:p>
+      <w:pPr>
+        <w:spacing w:after="120" w:line="276" w:lineRule="auto"/>
+        <w:rPr>
+          <w:rFonts w:ascii="Times New Roman" w:hAnsi="Times New Roman" w:cs="Times New Roman"/>
+        </w:rPr>
+      </w:pPr>
+    </w:p>
+    <w:p>
+      <w:pPr>
+        <w:spacing w:after="120" w:line="276" w:lineRule="auto"/>
+        <w:jc w:val="center"/>
+        <w:rPr>
+          <w:rFonts w:ascii="Times New Roman" w:hAnsi="Times New Roman" w:cs="Times New Roman"/>
+          <w:b/>
+          <w:bCs/>
+          <w:sz w:val="28"/>
+          <w:szCs w:val="28"/>
+        </w:rPr>
+      </w:pPr>
+      <w:r>
+        <w:rPr>
+          <w:rFonts w:ascii="Times New Roman" w:hAnsi="Times New Roman" w:cs="Times New Roman"/>
+          <w:b/>
+          <w:bCs/>
+          <w:sz w:val="28"/>
+          <w:szCs w:val="28"/>
+        </w:rPr>
+        <w:t>ПРЕТЕНЗИЯ</w:t>
+      </w:r>
+    </w:p>
+    <w:p>
+      <w:pPr>
+        <w:spacing w:after="120" w:line="276" w:lineRule="auto"/>
+        <w:jc w:val="center"/>
+        <w:rPr>
+          <w:rFonts w:ascii="Times New Roman" w:hAnsi="Times New Roman" w:cs="Times New Roman"/>
+        </w:rPr>
+      </w:pPr>
+      <w:r>
+        <w:rPr>
+          <w:rFonts w:ascii="Times New Roman" w:hAnsi="Times New Roman" w:cs="Times New Roman"/>
+        </w:rPr>
+        <w:t>о взыскании задолженности</w:t>
+      </w:r>
+    </w:p>
+    <w:p>
+      <w:pPr>
+        <w:spacing w:after="120" w:line="276" w:lineRule="auto"/>
+        <w:rPr>
+          <w:rFonts w:ascii="Times New Roman" w:hAnsi="Times New Roman" w:cs="Times New Roman"/>
+        </w:rPr>
+      </w:pPr>
+    </w:p>
+    <w:p>
+      <w:pPr>
+        <w:spacing w:after="120" w:line="276" w:lineRule="auto"/>
+        <w:ind w:firstLine="709"/>
+        <w:jc w:val="both"/>
+        <w:rPr>
+          <w:rFonts w:ascii="Times New Roman" w:hAnsi="Times New Roman" w:cs="Times New Roman"/>
+        </w:rPr>
+      </w:pPr>
+      <w:r>
+        <w:rPr>
+          <w:rFonts w:ascii="Times New Roman" w:hAnsi="Times New Roman" w:cs="Times New Roman"/>
+        </w:rPr>
+        <w:t>Между</w:t>
+      </w:r>
+      <w:r>
+        <w:rPr>
+          <w:rFonts w:ascii="Times New Roman" w:hAnsi="Times New Roman" w:cs="Times New Roman"/>
+        </w:rPr>
+        <w:t xml:space="preserve"> </w:t>
+      </w:r>
+      <w:r>
+        <w:rPr>
+          <w:rFonts w:ascii="Times New Roman" w:hAnsi="Times New Roman" w:cs="Times New Roman"/>
+        </w:rPr>
+        <w:t>сторонами</w:t>
+      </w:r>
+      <w:r>
+        <w:rPr>
+          <w:rFonts w:ascii="Times New Roman" w:hAnsi="Times New Roman" w:cs="Times New Roman"/>
+        </w:rPr>
+        <w:t xml:space="preserve"> </w:t>
+      </w:r>
+      <w:r>
+        <w:rPr>
+          <w:rFonts w:ascii="Times New Roman" w:hAnsi="Times New Roman" w:cs="Times New Roman"/>
+        </w:rPr>
+        <w:t>был</w:t>
+      </w:r>
+      <w:r>
+        <w:rPr>
+          <w:rFonts w:ascii="Times New Roman" w:hAnsi="Times New Roman" w:cs="Times New Roman"/>
+        </w:rPr>
+        <w:t xml:space="preserve"> </w:t>
+      </w:r>
+      <w:r>
+        <w:rPr>
+          <w:rFonts w:ascii="Times New Roman" w:hAnsi="Times New Roman" w:cs="Times New Roman"/>
+        </w:rPr>
+        <w:t>заключен</w:t>
+      </w:r>
+      <w:r>
+        <w:rPr>
+          <w:rFonts w:ascii="Times New Roman" w:hAnsi="Times New Roman" w:cs="Times New Roman"/>
+        </w:rPr>
+        <w:t xml:space="preserve"> </w:t>
+      </w:r>
+      <w:r>
+        <w:rPr>
+          <w:rFonts w:ascii="Times New Roman" w:hAnsi="Times New Roman" w:cs="Times New Roman"/>
+        </w:rPr>
+        <w:t>договор</w:t>
+      </w:r>
+      <w:r>
+        <w:rPr>
+          <w:rFonts w:ascii="Times New Roman" w:hAnsi="Times New Roman" w:cs="Times New Roman"/>
+        </w:rPr>
+        <w:t xml:space="preserve"> № </w:t>
       </w:r>
       <w:proofErr w:type="gramStart"/>
       <w:r>
@@ -66,12 +215,418 @@
         </w:rPr>
         <w:t xml:space="preserve">{{ </w:t>
       </w:r>
+      <w:r>
+        <w:rPr>
+          <w:rFonts w:ascii="Times New Roman" w:hAnsi="Times New Roman" w:cs="Times New Roman"/>
+          <w:lang w:val="en-US"/>
+        </w:rPr>
+        <w:t>contract</w:t>
+      </w:r>
+      <w:proofErr w:type="gramEnd"/>
+      <w:r>
+        <w:rPr>
+          <w:rFonts w:ascii="Times New Roman" w:hAnsi="Times New Roman" w:cs="Times New Roman"/>
+        </w:rPr>
+        <w:t>_</w:t>
+      </w:r>
+      <w:proofErr w:type="gramStart"/>
+      <w:r>
+        <w:rPr>
+          <w:rFonts w:ascii="Times New Roman" w:hAnsi="Times New Roman" w:cs="Times New Roman"/>
+          <w:lang w:val="en-US"/>
+        </w:rPr>
+        <w:t>number</w:t>
+      </w:r>
+      <w:r>
+        <w:rPr>
+          <w:rFonts w:ascii="Times New Roman" w:hAnsi="Times New Roman" w:cs="Times New Roman"/>
+        </w:rPr>
+        <w:t xml:space="preserve"> }</w:t>
+      </w:r>
+      <w:proofErr w:type="gramEnd"/>
+      <w:r>
+        <w:rPr>
+          <w:rFonts w:ascii="Times New Roman" w:hAnsi="Times New Roman" w:cs="Times New Roman"/>
+        </w:rPr>
+        <w:t xml:space="preserve">} </w:t>
+      </w:r>
+      <w:r>
+        <w:rPr>
+          <w:rFonts w:ascii="Times New Roman" w:hAnsi="Times New Roman" w:cs="Times New Roman"/>
+        </w:rPr>
+        <w:t>от</w:t>
+      </w:r>
+      <w:r>
+        <w:rPr>
+          <w:rFonts w:ascii="Times New Roman" w:hAnsi="Times New Roman" w:cs="Times New Roman"/>
+        </w:rPr>
+        <w:t xml:space="preserve"> </w:t>
+      </w:r>
+      <w:proofErr w:type="gramStart"/>
+      <w:r>
+        <w:rPr>
+          <w:rFonts w:ascii="Times New Roman" w:hAnsi="Times New Roman" w:cs="Times New Roman"/>
+        </w:rPr>
+        <w:t xml:space="preserve">{{ </w:t>
+      </w:r>
+      <w:r>
+        <w:rPr>
+          <w:rFonts w:ascii="Times New Roman" w:hAnsi="Times New Roman" w:cs="Times New Roman"/>
+          <w:lang w:val="en-US"/>
+        </w:rPr>
+        <w:t>contract</w:t>
+      </w:r>
+      <w:proofErr w:type="gramEnd"/>
+      <w:r>
+        <w:rPr>
+          <w:rFonts w:ascii="Times New Roman" w:hAnsi="Times New Roman" w:cs="Times New Roman"/>
+        </w:rPr>
+        <w:t>_</w:t>
+      </w:r>
+      <w:proofErr w:type="gramStart"/>
+      <w:r>
+        <w:rPr>
+          <w:rFonts w:ascii="Times New Roman" w:hAnsi="Times New Roman" w:cs="Times New Roman"/>
+          <w:lang w:val="en-US"/>
+        </w:rPr>
+        <w:t>date</w:t>
+      </w:r>
+      <w:r>
+        <w:rPr>
+          <w:rFonts w:ascii="Times New Roman" w:hAnsi="Times New Roman" w:cs="Times New Roman"/>
+        </w:rPr>
+        <w:t xml:space="preserve"> }</w:t>
+      </w:r>
+      <w:proofErr w:type="gramEnd"/>
+      <w:r>
+        <w:rPr>
+          <w:rFonts w:ascii="Times New Roman" w:hAnsi="Times New Roman" w:cs="Times New Roman"/>
+        </w:rPr>
+        <w:t>}.</w:t>
+      </w:r>
+    </w:p>
+    <w:p>
+      <w:pPr>
+        <w:spacing w:after="120" w:line="276" w:lineRule="auto"/>
+        <w:ind w:firstLine="709"/>
+        <w:jc w:val="both"/>
+        <w:rPr>
+          <w:rFonts w:ascii="Times New Roman" w:hAnsi="Times New Roman" w:cs="Times New Roman"/>
+        </w:rPr>
+      </w:pPr>
+    </w:p>
+    <w:p>
+      <w:pPr>
+        <w:spacing w:after="120" w:line="276" w:lineRule="auto"/>
+        <w:ind w:firstLine="709"/>
+        <w:jc w:val="both"/>
+        <w:rPr>
+          <w:rFonts w:ascii="Times New Roman" w:hAnsi="Times New Roman" w:cs="Times New Roman"/>
+          <w:b/>
+          <w:bCs/>
+        </w:rPr>
+      </w:pPr>
+      <w:r>
+        <w:rPr>
+          <w:rFonts w:ascii="Times New Roman" w:hAnsi="Times New Roman" w:cs="Times New Roman"/>
+          <w:b/>
+          <w:bCs/>
+        </w:rPr>
+        <w:t>Основание требований:</w:t>
+      </w:r>
+    </w:p>
+    <w:p>
+      <w:pPr>
+        <w:spacing w:after="120" w:line="276" w:lineRule="auto"/>
+        <w:ind w:firstLine="709"/>
+        <w:jc w:val="both"/>
+        <w:rPr>
+          <w:rFonts w:ascii="Times New Roman" w:hAnsi="Times New Roman" w:cs="Times New Roman"/>
+        </w:rPr>
+      </w:pPr>
+      <w:proofErr w:type="gramStart"/>
+      <w:r>
+        <w:rPr>
+          <w:rFonts w:ascii="Times New Roman" w:hAnsi="Times New Roman" w:cs="Times New Roman"/>
+        </w:rPr>
+        <w:t xml:space="preserve">{{ </w:t>
+      </w:r>
       <w:proofErr w:type="spellStart"/>
       <w:r>
         <w:rPr>
           <w:rFonts w:ascii="Times New Roman" w:hAnsi="Times New Roman" w:cs="Times New Roman"/>
         </w:rPr>
-        <w:t>sender</w:t>
+        <w:t>claim</w:t>
+      </w:r>
+      <w:proofErr w:type="gramEnd"/>
+      <w:r>
+        <w:rPr>
+          <w:rFonts w:ascii="Times New Roman" w:hAnsi="Times New Roman" w:cs="Times New Roman"/>
+        </w:rPr>
+        <w:t>_</w:t>
+      </w:r>
+      <w:proofErr w:type="gramStart"/>
+      <w:r>
+        <w:rPr>
+          <w:rFonts w:ascii="Times New Roman" w:hAnsi="Times New Roman" w:cs="Times New Roman"/>
+        </w:rPr>
+        <w:t>basis</w:t>
+      </w:r>
+      <w:proofErr w:type="spellEnd"/>
+      <w:r>
+        <w:rPr>
+          <w:rFonts w:ascii="Times New Roman" w:hAnsi="Times New Roman" w:cs="Times New Roman"/>
+        </w:rPr>
+        <w:t xml:space="preserve"> }</w:t>
+      </w:r>
+      <w:proofErr w:type="gramEnd"/>
+      <w:r>
+        <w:rPr>
+          <w:rFonts w:ascii="Times New Roman" w:hAnsi="Times New Roman" w:cs="Times New Roman"/>
+        </w:rPr>
+        <w:t>}</w:t>
+      </w:r>
+    </w:p>
+    <w:p>
+      <w:pPr>
+        <w:spacing w:after="120" w:line="276" w:lineRule="auto"/>
+        <w:ind w:firstLine="709"/>
+        <w:jc w:val="both"/>
+        <w:rPr>
+          <w:rFonts w:ascii="Times New Roman" w:hAnsi="Times New Roman" w:cs="Times New Roman"/>
+        </w:rPr>
+      </w:pPr>
+    </w:p>
+    <w:p>
+      <w:pPr>
+        <w:spacing w:after="120" w:line="276" w:lineRule="auto"/>
+        <w:ind w:firstLine="709"/>
+        <w:jc w:val="both"/>
+        <w:rPr>
+          <w:rFonts w:ascii="Times New Roman" w:hAnsi="Times New Roman" w:cs="Times New Roman"/>
+          <w:b/>
+          <w:bCs/>
+        </w:rPr>
+      </w:pPr>
+      <w:r>
+        <w:rPr>
+          <w:rFonts w:ascii="Times New Roman" w:hAnsi="Times New Roman" w:cs="Times New Roman"/>
+          <w:b/>
+          <w:bCs/>
+        </w:rPr>
+        <w:t>Сумма задолженности:</w:t>
+      </w:r>
+    </w:p>
+    <w:p>
+      <w:pPr>
+        <w:spacing w:after="120" w:line="276" w:lineRule="auto"/>
+        <w:ind w:firstLine="709"/>
+        <w:jc w:val="both"/>
+        <w:rPr>
+          <w:rFonts w:ascii="Times New Roman" w:hAnsi="Times New Roman" w:cs="Times New Roman"/>
+        </w:rPr>
+      </w:pPr>
+      <w:proofErr w:type="gramStart"/>
+      <w:r>
+        <w:rPr>
+          <w:rFonts w:ascii="Times New Roman" w:hAnsi="Times New Roman" w:cs="Times New Roman"/>
+        </w:rPr>
+        <w:t xml:space="preserve">{{ </w:t>
+      </w:r>
+      <w:r>
+        <w:rPr>
+          <w:rFonts w:ascii="Times New Roman" w:hAnsi="Times New Roman" w:cs="Times New Roman"/>
+          <w:lang w:val="en-US"/>
+        </w:rPr>
+        <w:t>debt</w:t>
+      </w:r>
+      <w:proofErr w:type="gramEnd"/>
+      <w:r>
+        <w:rPr>
+          <w:rFonts w:ascii="Times New Roman" w:hAnsi="Times New Roman" w:cs="Times New Roman"/>
+        </w:rPr>
+        <w:t>_</w:t>
+      </w:r>
+      <w:proofErr w:type="gramStart"/>
+      <w:r>
+        <w:rPr>
+          <w:rFonts w:ascii="Times New Roman" w:hAnsi="Times New Roman" w:cs="Times New Roman"/>
+          <w:lang w:val="en-US"/>
+        </w:rPr>
+        <w:t>amount</w:t>
+      </w:r>
+      <w:r>
+        <w:rPr>
+          <w:rFonts w:ascii="Times New Roman" w:hAnsi="Times New Roman" w:cs="Times New Roman"/>
+        </w:rPr>
+        <w:t xml:space="preserve"> }</w:t>
+      </w:r>
+      <w:proofErr w:type="gramEnd"/>
+      <w:r>
+        <w:rPr>
+          <w:rFonts w:ascii="Times New Roman" w:hAnsi="Times New Roman" w:cs="Times New Roman"/>
+        </w:rPr>
+        <w:t>}</w:t>
+      </w:r>
+    </w:p>
+    <w:p>
+      <w:pPr>
+        <w:spacing w:after="120" w:line="276" w:lineRule="auto"/>
+        <w:ind w:firstLine="709"/>
+        <w:jc w:val="both"/>
+        <w:rPr>
+          <w:rFonts w:ascii="Times New Roman" w:hAnsi="Times New Roman" w:cs="Times New Roman"/>
+        </w:rPr>
+      </w:pPr>
+    </w:p>
+    <w:p>
+      <w:pPr>
+        <w:spacing w:after="120" w:line="276" w:lineRule="auto"/>
+        <w:ind w:firstLine="709"/>
+        <w:jc w:val="both"/>
+        <w:rPr>
+          <w:rFonts w:ascii="Times New Roman" w:hAnsi="Times New Roman" w:cs="Times New Roman"/>
+          <w:b/>
+          <w:bCs/>
+        </w:rPr>
+      </w:pPr>
+      <w:r>
+        <w:rPr>
+          <w:rFonts w:ascii="Times New Roman" w:hAnsi="Times New Roman" w:cs="Times New Roman"/>
+          <w:b/>
+          <w:bCs/>
+        </w:rPr>
+        <w:t>Сумма</w:t>
+      </w:r>
+      <w:r>
+        <w:rPr>
+          <w:rFonts w:ascii="Times New Roman" w:hAnsi="Times New Roman" w:cs="Times New Roman"/>
+          <w:b/>
+          <w:bCs/>
+        </w:rPr>
+        <w:t xml:space="preserve"> </w:t>
+      </w:r>
+      <w:r>
+        <w:rPr>
+          <w:rFonts w:ascii="Times New Roman" w:hAnsi="Times New Roman" w:cs="Times New Roman"/>
+          <w:b/>
+          <w:bCs/>
+        </w:rPr>
+        <w:t>неустойки</w:t>
+      </w:r>
+      <w:r>
+        <w:rPr>
+          <w:rFonts w:ascii="Times New Roman" w:hAnsi="Times New Roman" w:cs="Times New Roman"/>
+          <w:b/>
+          <w:bCs/>
+        </w:rPr>
+        <w:t>:</w:t>
+      </w:r>
+    </w:p>
+    <w:p>
+      <w:pPr>
+        <w:spacing w:after="120" w:line="276" w:lineRule="auto"/>
+        <w:ind w:firstLine="709"/>
+        <w:jc w:val="both"/>
+        <w:rPr>
+          <w:rFonts w:ascii="Times New Roman" w:hAnsi="Times New Roman" w:cs="Times New Roman"/>
+        </w:rPr>
+      </w:pPr>
+      <w:proofErr w:type="gramStart"/>
+      <w:r>
+        <w:rPr>
+          <w:rFonts w:ascii="Times New Roman" w:hAnsi="Times New Roman" w:cs="Times New Roman"/>
+        </w:rPr>
+        <w:t xml:space="preserve">{{ </w:t>
+      </w:r>
+      <w:r>
+        <w:rPr>
+          <w:rFonts w:ascii="Times New Roman" w:hAnsi="Times New Roman" w:cs="Times New Roman"/>
+          <w:lang w:val="en-US"/>
+        </w:rPr>
+        <w:t>penalty</w:t>
+      </w:r>
+      <w:proofErr w:type="gramEnd"/>
+      <w:r>
+        <w:rPr>
+          <w:rFonts w:ascii="Times New Roman" w:hAnsi="Times New Roman" w:cs="Times New Roman"/>
+        </w:rPr>
+        <w:t>_</w:t>
+      </w:r>
+      <w:proofErr w:type="gramStart"/>
+      <w:r>
+        <w:rPr>
+          <w:rFonts w:ascii="Times New Roman" w:hAnsi="Times New Roman" w:cs="Times New Roman"/>
+          <w:lang w:val="en-US"/>
+        </w:rPr>
+        <w:t>amount</w:t>
+      </w:r>
+      <w:r>
+        <w:rPr>
+          <w:rFonts w:ascii="Times New Roman" w:hAnsi="Times New Roman" w:cs="Times New Roman"/>
+        </w:rPr>
+        <w:t xml:space="preserve"> }</w:t>
+      </w:r>
+      <w:proofErr w:type="gramEnd"/>
+      <w:r>
+        <w:rPr>
+          <w:rFonts w:ascii="Times New Roman" w:hAnsi="Times New Roman" w:cs="Times New Roman"/>
+        </w:rPr>
+        <w:t>}</w:t>
+      </w:r>
+    </w:p>
+    <w:p>
+      <w:pPr>
+        <w:spacing w:after="120" w:line="276" w:lineRule="auto"/>
+        <w:ind w:firstLine="709"/>
+        <w:jc w:val="both"/>
+        <w:rPr>
+          <w:rFonts w:ascii="Times New Roman" w:hAnsi="Times New Roman" w:cs="Times New Roman"/>
+        </w:rPr>
+      </w:pPr>
+    </w:p>
+    <w:p>
+      <w:pPr>
+        <w:spacing w:after="120" w:line="276" w:lineRule="auto"/>
+        <w:ind w:firstLine="709"/>
+        <w:jc w:val="both"/>
+        <w:rPr>
+          <w:rFonts w:ascii="Times New Roman" w:hAnsi="Times New Roman" w:cs="Times New Roman"/>
+          <w:b/>
+          <w:bCs/>
+        </w:rPr>
+      </w:pPr>
+      <w:r>
+        <w:rPr>
+          <w:rFonts w:ascii="Times New Roman" w:hAnsi="Times New Roman" w:cs="Times New Roman"/>
+          <w:b/>
+          <w:bCs/>
+        </w:rPr>
+        <w:t>Требование:</w:t>
+      </w:r>
+    </w:p>
+    <w:p>
+      <w:pPr>
+        <w:spacing w:after="120" w:line="276" w:lineRule="auto"/>
+        <w:ind w:firstLine="709"/>
+        <w:jc w:val="both"/>
+        <w:rPr>
+          <w:rFonts w:ascii="Times New Roman" w:hAnsi="Times New Roman" w:cs="Times New Roman"/>
+        </w:rPr>
+      </w:pPr>
+      <w:proofErr w:type="gramStart"/>
+      <w:r>
+        <w:rPr>
+          <w:rFonts w:ascii="Times New Roman" w:hAnsi="Times New Roman" w:cs="Times New Roman"/>
+        </w:rPr>
+        <w:t xml:space="preserve">{{ </w:t>
+      </w:r>
+      <w:proofErr w:type="spellStart"/>
+      <w:r>
+        <w:rPr>
+          <w:rFonts w:ascii="Times New Roman" w:hAnsi="Times New Roman" w:cs="Times New Roman"/>
+        </w:rPr>
+        <w:t>demand</w:t>
       </w:r>
       <w:proofErr w:type="spellEnd"/>
       <w:proofErr w:type="gramEnd"/>
@@ -84,21 +639,19 @@
     </w:p>
     <w:p>
       <w:pPr>
-        <w:rPr>
-          <w:rFonts w:ascii="Times New Roman" w:hAnsi="Times New Roman" w:cs="Times New Roman"/>
-        </w:rPr>
-      </w:pPr>
-    </w:p>
-    <w:p>
-      <w:pPr>
-        <w:rPr>
-          <w:rFonts w:ascii="Times New Roman" w:hAnsi="Times New Roman" w:cs="Times New Roman"/>
-        </w:rPr>
-      </w:pPr>
-    </w:p>
-    <w:p>
-      <w:pPr>
-        <w:jc w:val="center"/>
+        <w:spacing w:after="120" w:line="276" w:lineRule="auto"/>
+        <w:ind w:firstLine="709"/>
+        <w:jc w:val="both"/>
+        <w:rPr>
+          <w:rFonts w:ascii="Times New Roman" w:hAnsi="Times New Roman" w:cs="Times New Roman"/>
+        </w:rPr>
+      </w:pPr>
+    </w:p>
+    <w:p>
+      <w:pPr>
+        <w:spacing w:after="120" w:line="276" w:lineRule="auto"/>
+        <w:ind w:firstLine="709"/>
+        <w:jc w:val="both"/>
         <w:rPr>
           <w:rFonts w:ascii="Times New Roman" w:hAnsi="Times New Roman" w:cs="Times New Roman"/>
           <w:b/>
@@ -111,193 +664,55 @@
           <w:b/>
           <w:bCs/>
         </w:rPr>
-        <w:t>ПРЕТЕНЗИЯ</w:t>
-      </w:r>
-    </w:p>
-    <w:p>
-      <w:pPr>
-        <w:jc w:val="center"/>
-        <w:rPr>
-          <w:rFonts w:ascii="Times New Roman" w:hAnsi="Times New Roman" w:cs="Times New Roman"/>
-        </w:rPr>
-      </w:pPr>
-      <w:r>
-        <w:rPr>
-          <w:rFonts w:ascii="Times New Roman" w:hAnsi="Times New Roman" w:cs="Times New Roman"/>
-        </w:rPr>
-        <w:t>о взыскании задолженности</w:t>
-      </w:r>
-    </w:p>
-    <w:p>
-      <w:pPr>
-        <w:rPr>
-          <w:rFonts w:ascii="Times New Roman" w:hAnsi="Times New Roman" w:cs="Times New Roman"/>
-          <w:lang w:val="en-US"/>
-        </w:rPr>
-      </w:pPr>
-    </w:p>
-    <w:p>
-      <w:pPr>
-        <w:jc w:val="both"/>
-        <w:rPr>
-          <w:rFonts w:ascii="Times New Roman" w:hAnsi="Times New Roman" w:cs="Times New Roman"/>
-          <w:lang w:val="en-US"/>
-        </w:rPr>
-      </w:pPr>
-      <w:r>
-        <w:rPr>
-          <w:rFonts w:ascii="Times New Roman" w:hAnsi="Times New Roman" w:cs="Times New Roman"/>
-        </w:rPr>
-        <w:t>Между</w:t>
-      </w:r>
-      <w:r>
-        <w:rPr>
-          <w:rFonts w:ascii="Times New Roman" w:hAnsi="Times New Roman" w:cs="Times New Roman"/>
-          <w:lang w:val="en-US"/>
-        </w:rPr>
-        <w:t xml:space="preserve"> </w:t>
-      </w:r>
-      <w:r>
-        <w:rPr>
-          <w:rFonts w:ascii="Times New Roman" w:hAnsi="Times New Roman" w:cs="Times New Roman"/>
-        </w:rPr>
-        <w:t>сторонами</w:t>
-      </w:r>
-      <w:r>
-        <w:rPr>
-          <w:rFonts w:ascii="Times New Roman" w:hAnsi="Times New Roman" w:cs="Times New Roman"/>
-          <w:lang w:val="en-US"/>
-        </w:rPr>
-        <w:t xml:space="preserve"> </w:t>
-      </w:r>
-      <w:r>
-        <w:rPr>
-          <w:rFonts w:ascii="Times New Roman" w:hAnsi="Times New Roman" w:cs="Times New Roman"/>
-        </w:rPr>
-        <w:t>был</w:t>
-      </w:r>
-      <w:r>
-        <w:rPr>
-          <w:rFonts w:ascii="Times New Roman" w:hAnsi="Times New Roman" w:cs="Times New Roman"/>
-          <w:lang w:val="en-US"/>
-        </w:rPr>
-        <w:t xml:space="preserve"> </w:t>
-      </w:r>
-      <w:r>
-        <w:rPr>
-          <w:rFonts w:ascii="Times New Roman" w:hAnsi="Times New Roman" w:cs="Times New Roman"/>
-        </w:rPr>
-        <w:t>заключен</w:t>
-      </w:r>
-      <w:r>
-        <w:rPr>
-          <w:rFonts w:ascii="Times New Roman" w:hAnsi="Times New Roman" w:cs="Times New Roman"/>
-          <w:lang w:val="en-US"/>
-        </w:rPr>
-        <w:t xml:space="preserve"> </w:t>
-      </w:r>
-      <w:r>
-        <w:rPr>
-          <w:rFonts w:ascii="Times New Roman" w:hAnsi="Times New Roman" w:cs="Times New Roman"/>
-        </w:rPr>
-        <w:t>договор</w:t>
-      </w:r>
-      <w:r>
-        <w:rPr>
-          <w:rFonts w:ascii="Times New Roman" w:hAnsi="Times New Roman" w:cs="Times New Roman"/>
-          <w:lang w:val="en-US"/>
-        </w:rPr>
-        <w:t xml:space="preserve"> № </w:t>
-      </w:r>
+        <w:t>Срок исполнения требования:</w:t>
+      </w:r>
+    </w:p>
+    <w:p>
+      <w:pPr>
+        <w:spacing w:after="120" w:line="276" w:lineRule="auto"/>
+        <w:ind w:firstLine="709"/>
+        <w:jc w:val="both"/>
+        <w:rPr>
+          <w:rFonts w:ascii="Times New Roman" w:hAnsi="Times New Roman" w:cs="Times New Roman"/>
+        </w:rPr>
+      </w:pPr>
       <w:proofErr w:type="gramStart"/>
       <w:r>
         <w:rPr>
           <w:rFonts w:ascii="Times New Roman" w:hAnsi="Times New Roman" w:cs="Times New Roman"/>
-          <w:lang w:val="en-US"/>
-        </w:rPr>
-        <w:t>{{ contract</w:t>
-      </w:r>
+        </w:rPr>
+        <w:t xml:space="preserve">{{ </w:t>
+      </w:r>
+      <w:proofErr w:type="spellStart"/>
+      <w:r>
+        <w:rPr>
+          <w:rFonts w:ascii="Times New Roman" w:hAnsi="Times New Roman" w:cs="Times New Roman"/>
+        </w:rPr>
+        <w:t>deadline</w:t>
+      </w:r>
+      <w:proofErr w:type="spellEnd"/>
       <w:proofErr w:type="gramEnd"/>
       <w:r>
         <w:rPr>
           <w:rFonts w:ascii="Times New Roman" w:hAnsi="Times New Roman" w:cs="Times New Roman"/>
-          <w:lang w:val="en-US"/>
-        </w:rPr>
-        <w:t>_</w:t>
-      </w:r>
-      <w:proofErr w:type="gramStart"/>
-      <w:r>
-        <w:rPr>
-          <w:rFonts w:ascii="Times New Roman" w:hAnsi="Times New Roman" w:cs="Times New Roman"/>
-          <w:lang w:val="en-US"/>
-        </w:rPr>
-        <w:t>number }</w:t>
-      </w:r>
-      <w:proofErr w:type="gramEnd"/>
-      <w:r>
-        <w:rPr>
-          <w:rFonts w:ascii="Times New Roman" w:hAnsi="Times New Roman" w:cs="Times New Roman"/>
-          <w:lang w:val="en-US"/>
-        </w:rPr>
-        <w:t xml:space="preserve">} </w:t>
-      </w:r>
-      <w:r>
-        <w:rPr>
-          <w:rFonts w:ascii="Times New Roman" w:hAnsi="Times New Roman" w:cs="Times New Roman"/>
-        </w:rPr>
-        <w:t>от</w:t>
-      </w:r>
-      <w:r>
-        <w:rPr>
-          <w:rFonts w:ascii="Times New Roman" w:hAnsi="Times New Roman" w:cs="Times New Roman"/>
-          <w:lang w:val="en-US"/>
-        </w:rPr>
-        <w:t xml:space="preserve"> </w:t>
-      </w:r>
-      <w:proofErr w:type="gramStart"/>
-      <w:r>
-        <w:rPr>
-          <w:rFonts w:ascii="Times New Roman" w:hAnsi="Times New Roman" w:cs="Times New Roman"/>
-          <w:lang w:val="en-US"/>
-        </w:rPr>
-        <w:t>{{ contract</w:t>
-      </w:r>
-      <w:proofErr w:type="gramEnd"/>
-      <w:r>
-        <w:rPr>
-          <w:rFonts w:ascii="Times New Roman" w:hAnsi="Times New Roman" w:cs="Times New Roman"/>
-          <w:lang w:val="en-US"/>
-        </w:rPr>
-        <w:t>_</w:t>
-      </w:r>
-      <w:proofErr w:type="gramStart"/>
-      <w:r>
-        <w:rPr>
-          <w:rFonts w:ascii="Times New Roman" w:hAnsi="Times New Roman" w:cs="Times New Roman"/>
-          <w:lang w:val="en-US"/>
-        </w:rPr>
-        <w:t>date }</w:t>
-      </w:r>
-      <w:proofErr w:type="gramEnd"/>
-      <w:r>
-        <w:rPr>
-          <w:rFonts w:ascii="Times New Roman" w:hAnsi="Times New Roman" w:cs="Times New Roman"/>
-          <w:lang w:val="en-US"/>
-        </w:rPr>
-        <w:t>}.</w:t>
-      </w:r>
-    </w:p>
-    <w:p>
-      <w:pPr>
-        <w:jc w:val="both"/>
-        <w:rPr>
-          <w:rFonts w:ascii="Times New Roman" w:hAnsi="Times New Roman" w:cs="Times New Roman"/>
-          <w:lang w:val="en-US"/>
-        </w:rPr>
-      </w:pPr>
-    </w:p>
-    <w:p>
-      <w:pPr>
+        </w:rPr>
+        <w:t xml:space="preserve"> }}</w:t>
+      </w:r>
+    </w:p>
+    <w:p>
+      <w:pPr>
+        <w:spacing w:after="120" w:line="276" w:lineRule="auto"/>
+        <w:ind w:firstLine="709"/>
+        <w:jc w:val="both"/>
+        <w:rPr>
+          <w:rFonts w:ascii="Times New Roman" w:hAnsi="Times New Roman" w:cs="Times New Roman"/>
+        </w:rPr>
+      </w:pPr>
+    </w:p>
+    <w:p>
+      <w:pPr>
+        <w:spacing w:after="120" w:line="276" w:lineRule="auto"/>
+        <w:ind w:firstLine="709"/>
         <w:jc w:val="both"/>
         <w:rPr>
           <w:rFonts w:ascii="Times New Roman" w:hAnsi="Times New Roman" w:cs="Times New Roman"/>
@@ -311,11 +726,13 @@
           <w:b/>
           <w:bCs/>
         </w:rPr>
-        <w:t>Основание требований:</w:t>
-      </w:r>
-    </w:p>
-    <w:p>
-      <w:pPr>
+        <w:t>Доказательства:</w:t>
+      </w:r>
+    </w:p>
+    <w:p>
+      <w:pPr>
+        <w:spacing w:after="120" w:line="276" w:lineRule="auto"/>
+        <w:ind w:firstLine="709"/>
         <w:jc w:val="both"/>
         <w:rPr>
           <w:rFonts w:ascii="Times New Roman" w:hAnsi="Times New Roman" w:cs="Times New Roman"/>
@@ -333,47 +750,31 @@
         <w:rPr>
           <w:rFonts w:ascii="Times New Roman" w:hAnsi="Times New Roman" w:cs="Times New Roman"/>
         </w:rPr>
-        <w:t>claim</w:t>
-      </w:r>
+        <w:t>evidence</w:t>
+      </w:r>
+      <w:proofErr w:type="spellEnd"/>
       <w:proofErr w:type="gramEnd"/>
       <w:r>
         <w:rPr>
           <w:rFonts w:ascii="Times New Roman" w:hAnsi="Times New Roman" w:cs="Times New Roman"/>
         </w:rPr>
-        <w:t>_</w:t>
-      </w:r>
-      <w:proofErr w:type="gramStart"/>
-      <w:r>
-        <w:rPr>
-          <w:rFonts w:ascii="Times New Roman" w:hAnsi="Times New Roman" w:cs="Times New Roman"/>
-        </w:rPr>
-        <w:t>basis</w:t>
-      </w:r>
-      <w:proofErr w:type="spellEnd"/>
-      <w:r>
-        <w:rPr>
-          <w:rFonts w:ascii="Times New Roman" w:hAnsi="Times New Roman" w:cs="Times New Roman"/>
-        </w:rPr>
-        <w:t xml:space="preserve"> }</w:t>
-      </w:r>
-      <w:proofErr w:type="gramEnd"/>
-      <w:r>
-        <w:rPr>
-          <w:rFonts w:ascii="Times New Roman" w:hAnsi="Times New Roman" w:cs="Times New Roman"/>
-        </w:rPr>
-        <w:t>}</w:t>
-      </w:r>
-    </w:p>
-    <w:p>
-      <w:pPr>
-        <w:jc w:val="both"/>
-        <w:rPr>
-          <w:rFonts w:ascii="Times New Roman" w:hAnsi="Times New Roman" w:cs="Times New Roman"/>
-        </w:rPr>
-      </w:pPr>
-    </w:p>
-    <w:p>
-      <w:pPr>
+        <w:t xml:space="preserve"> }}</w:t>
+      </w:r>
+    </w:p>
+    <w:p>
+      <w:pPr>
+        <w:spacing w:after="120" w:line="276" w:lineRule="auto"/>
+        <w:ind w:firstLine="709"/>
+        <w:jc w:val="both"/>
+        <w:rPr>
+          <w:rFonts w:ascii="Times New Roman" w:hAnsi="Times New Roman" w:cs="Times New Roman"/>
+        </w:rPr>
+      </w:pPr>
+    </w:p>
+    <w:p>
+      <w:pPr>
+        <w:spacing w:after="120" w:line="276" w:lineRule="auto"/>
+        <w:ind w:firstLine="709"/>
         <w:jc w:val="both"/>
         <w:rPr>
           <w:rFonts w:ascii="Times New Roman" w:hAnsi="Times New Roman" w:cs="Times New Roman"/>
@@ -387,22 +788,22 @@
           <w:b/>
           <w:bCs/>
         </w:rPr>
-        <w:t>Сумма задолженности:</w:t>
-      </w:r>
-    </w:p>
-    <w:p>
-      <w:pPr>
-        <w:jc w:val="both"/>
-        <w:rPr>
-          <w:rFonts w:ascii="Times New Roman" w:hAnsi="Times New Roman" w:cs="Times New Roman"/>
-          <w:lang w:val="en-US"/>
+        <w:t>Приложения:</w:t>
+      </w:r>
+    </w:p>
+    <w:p>
+      <w:pPr>
+        <w:spacing w:after="120" w:line="276" w:lineRule="auto"/>
+        <w:ind w:firstLine="709"/>
+        <w:jc w:val="both"/>
+        <w:rPr>
+          <w:rFonts w:ascii="Times New Roman" w:hAnsi="Times New Roman" w:cs="Times New Roman"/>
         </w:rPr>
       </w:pPr>
       <w:proofErr w:type="gramStart"/>
       <w:r>
         <w:rPr>
           <w:rFonts w:ascii="Times New Roman" w:hAnsi="Times New Roman" w:cs="Times New Roman"/>
-          <w:lang w:val="en-US"/>
         </w:rPr>
         <w:t xml:space="preserve">{{ </w:t>
       </w:r>
@@ -410,201 +811,8 @@
       <w:r>
         <w:rPr>
           <w:rFonts w:ascii="Times New Roman" w:hAnsi="Times New Roman" w:cs="Times New Roman"/>
-          <w:lang w:val="en-US"/>
-        </w:rPr>
-        <w:t>debt</w:t>
-      </w:r>
-      <w:proofErr w:type="gramEnd"/>
-      <w:r>
-        <w:rPr>
-          <w:rFonts w:ascii="Times New Roman" w:hAnsi="Times New Roman" w:cs="Times New Roman"/>
-          <w:lang w:val="en-US"/>
-        </w:rPr>
-        <w:t>_</w:t>
-      </w:r>
-      <w:proofErr w:type="gramStart"/>
-      <w:r>
-        <w:rPr>
-          <w:rFonts w:ascii="Times New Roman" w:hAnsi="Times New Roman" w:cs="Times New Roman"/>
-          <w:lang w:val="en-US"/>
-        </w:rPr>
-        <w:t>amount</w:t>
-      </w:r>
-      <w:proofErr w:type="spellEnd"/>
-      <w:r>
-        <w:rPr>
-          <w:rFonts w:ascii="Times New Roman" w:hAnsi="Times New Roman" w:cs="Times New Roman"/>
-          <w:lang w:val="en-US"/>
-        </w:rPr>
-        <w:t xml:space="preserve"> }</w:t>
-      </w:r>
-      <w:proofErr w:type="gramEnd"/>
-      <w:r>
-        <w:rPr>
-          <w:rFonts w:ascii="Times New Roman" w:hAnsi="Times New Roman" w:cs="Times New Roman"/>
-          <w:lang w:val="en-US"/>
-        </w:rPr>
-        <w:t>}</w:t>
-      </w:r>
-    </w:p>
-    <w:p>
-      <w:pPr>
-        <w:jc w:val="both"/>
-        <w:rPr>
-          <w:rFonts w:ascii="Times New Roman" w:hAnsi="Times New Roman" w:cs="Times New Roman"/>
-          <w:lang w:val="en-US"/>
-        </w:rPr>
-      </w:pPr>
-    </w:p>
-    <w:p>
-      <w:pPr>
-        <w:jc w:val="both"/>
-        <w:rPr>
-          <w:rFonts w:ascii="Times New Roman" w:hAnsi="Times New Roman" w:cs="Times New Roman"/>
-          <w:b/>
-          <w:bCs/>
-          <w:lang w:val="en-US"/>
-        </w:rPr>
-      </w:pPr>
-      <w:r>
-        <w:rPr>
-          <w:rFonts w:ascii="Times New Roman" w:hAnsi="Times New Roman" w:cs="Times New Roman"/>
-          <w:b/>
-          <w:bCs/>
-        </w:rPr>
-        <w:t>Сумма</w:t>
-      </w:r>
-      <w:r>
-        <w:rPr>
-          <w:rFonts w:ascii="Times New Roman" w:hAnsi="Times New Roman" w:cs="Times New Roman"/>
-          <w:b/>
-          <w:bCs/>
-          <w:lang w:val="en-US"/>
-        </w:rPr>
-        <w:t xml:space="preserve"> </w:t>
-      </w:r>
-      <w:r>
-        <w:rPr>
-          <w:rFonts w:ascii="Times New Roman" w:hAnsi="Times New Roman" w:cs="Times New Roman"/>
-          <w:b/>
-          <w:bCs/>
-        </w:rPr>
-        <w:t>неустойки</w:t>
-      </w:r>
-      <w:r>
-        <w:rPr>
-          <w:rFonts w:ascii="Times New Roman" w:hAnsi="Times New Roman" w:cs="Times New Roman"/>
-          <w:b/>
-          <w:bCs/>
-          <w:lang w:val="en-US"/>
-        </w:rPr>
-        <w:t>:</w:t>
-      </w:r>
-    </w:p>
-    <w:p>
-      <w:pPr>
-        <w:jc w:val="both"/>
-        <w:rPr>
-          <w:rFonts w:ascii="Times New Roman" w:hAnsi="Times New Roman" w:cs="Times New Roman"/>
-          <w:lang w:val="en-US"/>
-        </w:rPr>
-      </w:pPr>
-      <w:proofErr w:type="gramStart"/>
-      <w:r>
-        <w:rPr>
-          <w:rFonts w:ascii="Times New Roman" w:hAnsi="Times New Roman" w:cs="Times New Roman"/>
-          <w:lang w:val="en-US"/>
-        </w:rPr>
-        <w:t xml:space="preserve">{{ </w:t>
-      </w:r>
-      <w:proofErr w:type="spellStart"/>
-      <w:r>
-        <w:rPr>
-          <w:rFonts w:ascii="Times New Roman" w:hAnsi="Times New Roman" w:cs="Times New Roman"/>
-          <w:lang w:val="en-US"/>
-        </w:rPr>
-        <w:t>penalty</w:t>
-      </w:r>
-      <w:proofErr w:type="gramEnd"/>
-      <w:r>
-        <w:rPr>
-          <w:rFonts w:ascii="Times New Roman" w:hAnsi="Times New Roman" w:cs="Times New Roman"/>
-          <w:lang w:val="en-US"/>
-        </w:rPr>
-        <w:t>_</w:t>
-      </w:r>
-      <w:proofErr w:type="gramStart"/>
-      <w:r>
-        <w:rPr>
-          <w:rFonts w:ascii="Times New Roman" w:hAnsi="Times New Roman" w:cs="Times New Roman"/>
-          <w:lang w:val="en-US"/>
-        </w:rPr>
-        <w:t>amount</w:t>
-      </w:r>
-      <w:proofErr w:type="spellEnd"/>
-      <w:r>
-        <w:rPr>
-          <w:rFonts w:ascii="Times New Roman" w:hAnsi="Times New Roman" w:cs="Times New Roman"/>
-          <w:lang w:val="en-US"/>
-        </w:rPr>
-        <w:t xml:space="preserve"> }</w:t>
-      </w:r>
-      <w:proofErr w:type="gramEnd"/>
-      <w:r>
-        <w:rPr>
-          <w:rFonts w:ascii="Times New Roman" w:hAnsi="Times New Roman" w:cs="Times New Roman"/>
-          <w:lang w:val="en-US"/>
-        </w:rPr>
-        <w:t>}</w:t>
-      </w:r>
-    </w:p>
-    <w:p>
-      <w:pPr>
-        <w:jc w:val="both"/>
-        <w:rPr>
-          <w:rFonts w:ascii="Times New Roman" w:hAnsi="Times New Roman" w:cs="Times New Roman"/>
-          <w:lang w:val="en-US"/>
-        </w:rPr>
-      </w:pPr>
-    </w:p>
-    <w:p>
-      <w:pPr>
-        <w:jc w:val="both"/>
-        <w:rPr>
-          <w:rFonts w:ascii="Times New Roman" w:hAnsi="Times New Roman" w:cs="Times New Roman"/>
-          <w:b/>
-          <w:bCs/>
-        </w:rPr>
-      </w:pPr>
-      <w:r>
-        <w:rPr>
-          <w:rFonts w:ascii="Times New Roman" w:hAnsi="Times New Roman" w:cs="Times New Roman"/>
-          <w:b/>
-          <w:bCs/>
-        </w:rPr>
-        <w:t>Требование:</w:t>
-      </w:r>
-    </w:p>
-    <w:p>
-      <w:pPr>
-        <w:jc w:val="both"/>
-        <w:rPr>
-          <w:rFonts w:ascii="Times New Roman" w:hAnsi="Times New Roman" w:cs="Times New Roman"/>
-        </w:rPr>
-      </w:pPr>
-      <w:proofErr w:type="gramStart"/>
-      <w:r>
-        <w:rPr>
-          <w:rFonts w:ascii="Times New Roman" w:hAnsi="Times New Roman" w:cs="Times New Roman"/>
-        </w:rPr>
-        <w:t xml:space="preserve">{{ </w:t>
-      </w:r>
-      <w:proofErr w:type="spellStart"/>
-      <w:r>
-        <w:rPr>
-          <w:rFonts w:ascii="Times New Roman" w:hAnsi="Times New Roman" w:cs="Times New Roman"/>
-        </w:rPr>
-        <w:t>demand</w:t>
+        </w:rPr>
+        <w:t>attachments</w:t>
       </w:r>
       <w:proofErr w:type="spellEnd"/>
       <w:proofErr w:type="gramEnd"/>
@@ -617,196 +825,35 @@
     </w:p>
     <w:p>
       <w:pPr>
-        <w:jc w:val="both"/>
-        <w:rPr>
-          <w:rFonts w:ascii="Times New Roman" w:hAnsi="Times New Roman" w:cs="Times New Roman"/>
-        </w:rPr>
-      </w:pPr>
-    </w:p>
-    <w:p>
-      <w:pPr>
-        <w:jc w:val="both"/>
-        <w:rPr>
-          <w:rFonts w:ascii="Times New Roman" w:hAnsi="Times New Roman" w:cs="Times New Roman"/>
-          <w:b/>
-          <w:bCs/>
-        </w:rPr>
-      </w:pPr>
-      <w:r>
-        <w:rPr>
-          <w:rFonts w:ascii="Times New Roman" w:hAnsi="Times New Roman" w:cs="Times New Roman"/>
-          <w:b/>
-          <w:bCs/>
-        </w:rPr>
-        <w:t>Срок исполнения требования:</w:t>
-      </w:r>
-    </w:p>
-    <w:p>
-      <w:pPr>
-        <w:jc w:val="both"/>
-        <w:rPr>
-          <w:rFonts w:ascii="Times New Roman" w:hAnsi="Times New Roman" w:cs="Times New Roman"/>
-        </w:rPr>
-      </w:pPr>
-      <w:proofErr w:type="gramStart"/>
-      <w:r>
-        <w:rPr>
-          <w:rFonts w:ascii="Times New Roman" w:hAnsi="Times New Roman" w:cs="Times New Roman"/>
-        </w:rPr>
-        <w:t xml:space="preserve">{{ </w:t>
-      </w:r>
-      <w:proofErr w:type="spellStart"/>
-      <w:r>
-        <w:rPr>
-          <w:rFonts w:ascii="Times New Roman" w:hAnsi="Times New Roman" w:cs="Times New Roman"/>
-        </w:rPr>
-        <w:t>deadline</w:t>
-      </w:r>
-      <w:proofErr w:type="spellEnd"/>
-      <w:proofErr w:type="gramEnd"/>
-      <w:r>
-        <w:rPr>
-          <w:rFonts w:ascii="Times New Roman" w:hAnsi="Times New Roman" w:cs="Times New Roman"/>
-        </w:rPr>
-        <w:t xml:space="preserve"> }}</w:t>
-      </w:r>
-    </w:p>
-    <w:p>
-      <w:pPr>
-        <w:jc w:val="both"/>
-        <w:rPr>
-          <w:rFonts w:ascii="Times New Roman" w:hAnsi="Times New Roman" w:cs="Times New Roman"/>
-        </w:rPr>
-      </w:pPr>
-    </w:p>
-    <w:p>
-      <w:pPr>
-        <w:jc w:val="both"/>
-        <w:rPr>
-          <w:rFonts w:ascii="Times New Roman" w:hAnsi="Times New Roman" w:cs="Times New Roman"/>
-          <w:b/>
-          <w:bCs/>
-        </w:rPr>
-      </w:pPr>
-      <w:r>
-        <w:rPr>
-          <w:rFonts w:ascii="Times New Roman" w:hAnsi="Times New Roman" w:cs="Times New Roman"/>
-          <w:b/>
-          <w:bCs/>
-        </w:rPr>
-        <w:t>Доказательства:</w:t>
-      </w:r>
-    </w:p>
-    <w:p>
-      <w:pPr>
-        <w:jc w:val="both"/>
-        <w:rPr>
-          <w:rFonts w:ascii="Times New Roman" w:hAnsi="Times New Roman" w:cs="Times New Roman"/>
-        </w:rPr>
-      </w:pPr>
-      <w:proofErr w:type="gramStart"/>
-      <w:r>
-        <w:rPr>
-          <w:rFonts w:ascii="Times New Roman" w:hAnsi="Times New Roman" w:cs="Times New Roman"/>
-        </w:rPr>
-        <w:t xml:space="preserve">{{ </w:t>
-      </w:r>
-      <w:proofErr w:type="spellStart"/>
-      <w:r>
-        <w:rPr>
-          <w:rFonts w:ascii="Times New Roman" w:hAnsi="Times New Roman" w:cs="Times New Roman"/>
-        </w:rPr>
-        <w:t>evidence</w:t>
-      </w:r>
-      <w:proofErr w:type="spellEnd"/>
-      <w:proofErr w:type="gramEnd"/>
-      <w:r>
-        <w:rPr>
-          <w:rFonts w:ascii="Times New Roman" w:hAnsi="Times New Roman" w:cs="Times New Roman"/>
-        </w:rPr>
-        <w:t xml:space="preserve"> }}</w:t>
-      </w:r>
-    </w:p>
-    <w:p>
-      <w:pPr>
-        <w:jc w:val="both"/>
-        <w:rPr>
-          <w:rFonts w:ascii="Times New Roman" w:hAnsi="Times New Roman" w:cs="Times New Roman"/>
-        </w:rPr>
-      </w:pPr>
-    </w:p>
-    <w:p>
-      <w:pPr>
-        <w:jc w:val="both"/>
-        <w:rPr>
-          <w:rFonts w:ascii="Times New Roman" w:hAnsi="Times New Roman" w:cs="Times New Roman"/>
-          <w:b/>
-          <w:bCs/>
-        </w:rPr>
-      </w:pPr>
-      <w:r>
-        <w:rPr>
-          <w:rFonts w:ascii="Times New Roman" w:hAnsi="Times New Roman" w:cs="Times New Roman"/>
-          <w:b/>
-          <w:bCs/>
-        </w:rPr>
-        <w:t>Приложения:</w:t>
-      </w:r>
-    </w:p>
-    <w:p>
-      <w:pPr>
-        <w:jc w:val="both"/>
-        <w:rPr>
-          <w:rFonts w:ascii="Times New Roman" w:hAnsi="Times New Roman" w:cs="Times New Roman"/>
-        </w:rPr>
-      </w:pPr>
-      <w:proofErr w:type="gramStart"/>
-      <w:r>
-        <w:rPr>
-          <w:rFonts w:ascii="Times New Roman" w:hAnsi="Times New Roman" w:cs="Times New Roman"/>
-        </w:rPr>
-        <w:t xml:space="preserve">{{ </w:t>
-      </w:r>
-      <w:proofErr w:type="spellStart"/>
-      <w:r>
-        <w:rPr>
-          <w:rFonts w:ascii="Times New Roman" w:hAnsi="Times New Roman" w:cs="Times New Roman"/>
-        </w:rPr>
-        <w:t>attachments</w:t>
-      </w:r>
-      <w:proofErr w:type="spellEnd"/>
-      <w:proofErr w:type="gramEnd"/>
-      <w:r>
-        <w:rPr>
-          <w:rFonts w:ascii="Times New Roman" w:hAnsi="Times New Roman" w:cs="Times New Roman"/>
-        </w:rPr>
-        <w:t xml:space="preserve"> }}</w:t>
-      </w:r>
-    </w:p>
-    <w:p>
-      <w:pPr>
-        <w:rPr>
-          <w:rFonts w:ascii="Times New Roman" w:hAnsi="Times New Roman" w:cs="Times New Roman"/>
-        </w:rPr>
-      </w:pPr>
-    </w:p>
-    <w:p>
-      <w:pPr>
-        <w:rPr>
-          <w:rFonts w:ascii="Times New Roman" w:hAnsi="Times New Roman" w:cs="Times New Roman"/>
-        </w:rPr>
-      </w:pPr>
-    </w:p>
-    <w:p>
-      <w:pPr>
-        <w:rPr>
-          <w:rFonts w:ascii="Times New Roman" w:hAnsi="Times New Roman" w:cs="Times New Roman"/>
-        </w:rPr>
-      </w:pPr>
-      <w:r>
-        <w:rPr>
-          <w:rFonts w:ascii="Times New Roman" w:hAnsi="Times New Roman" w:cs="Times New Roman"/>
-        </w:rPr>
+        <w:spacing w:after="120" w:line="276" w:lineRule="auto"/>
+        <w:ind w:firstLine="709"/>
+        <w:rPr>
+          <w:rFonts w:ascii="Times New Roman" w:hAnsi="Times New Roman" w:cs="Times New Roman"/>
+        </w:rPr>
+      </w:pPr>
+    </w:p>
+    <w:p>
+      <w:pPr>
+        <w:spacing w:after="120" w:line="276" w:lineRule="auto"/>
+        <w:ind w:firstLine="709"/>
+        <w:rPr>
+          <w:rFonts w:ascii="Times New Roman" w:hAnsi="Times New Roman" w:cs="Times New Roman"/>
+        </w:rPr>
+      </w:pPr>
+    </w:p>
+    <w:p>
+      <w:pPr>
+        <w:spacing w:after="120" w:line="276" w:lineRule="auto"/>
+        <w:ind w:firstLine="709"/>
+        <w:rPr>
+          <w:rFonts w:ascii="Times New Roman" w:hAnsi="Times New Roman" w:cs="Times New Roman"/>
+        </w:rPr>
+      </w:pPr>
+      <w:r>
+        <w:rPr>
+          <w:rFonts w:ascii="Times New Roman" w:hAnsi="Times New Roman" w:cs="Times New Roman"/>
+        </w:rPr>
+        <w:lastRenderedPageBreak/>
         <w:t>Подпись: ___________________</w:t>
       </w:r>
     </w:p>

</xml_diff>